<commit_message>
RCI Report Formatting changes
</commit_message>
<xml_diff>
--- a/backend/backend/assets/rci_report_template.docx
+++ b/backend/backend/assets/rci_report_template.docx
@@ -7725,10 +7725,6 @@
     <w:p>
       <w:pPr>
         <w:pStyle w:val="Heading1"/>
-        <w:numPr>
-          <w:ilvl w:val="0"/>
-          <w:numId w:val="2"/>
-        </w:numPr>
         <w:spacing w:after="240"/>
         <w:ind w:hanging="578"/>
         <w:rPr>
@@ -8281,10 +8277,6 @@
     <w:p>
       <w:pPr>
         <w:pStyle w:val="Heading1"/>
-        <w:numPr>
-          <w:ilvl w:val="0"/>
-          <w:numId w:val="2"/>
-        </w:numPr>
         <w:spacing w:after="240"/>
         <w:ind w:left="142" w:hanging="426"/>
         <w:rPr>
@@ -8303,7 +8295,8 @@
           <w:sz w:val="22"/>
           <w:szCs w:val="22"/>
         </w:rPr>
-        <w:lastRenderedPageBreak/>
+        <w:t>6.</w:t>
+        <w:tab/>
         <w:t>Impact Assessment</w:t>
       </w:r>
       <w:r>
@@ -8613,10 +8606,6 @@
     <w:p>
       <w:pPr>
         <w:pStyle w:val="Heading1"/>
-        <w:numPr>
-          <w:ilvl w:val="0"/>
-          <w:numId w:val="2"/>
-        </w:numPr>
         <w:spacing w:after="240"/>
         <w:ind w:left="142" w:hanging="578"/>
         <w:rPr>
@@ -11358,10 +11347,6 @@
     <w:p>
       <w:pPr>
         <w:pStyle w:val="Heading1"/>
-        <w:numPr>
-          <w:ilvl w:val="0"/>
-          <w:numId w:val="17"/>
-        </w:numPr>
         <w:spacing w:after="240"/>
         <w:ind w:left="142" w:hanging="578"/>
         <w:rPr>
@@ -11867,10 +11852,6 @@
     <w:p>
       <w:pPr>
         <w:pStyle w:val="Heading1"/>
-        <w:numPr>
-          <w:ilvl w:val="0"/>
-          <w:numId w:val="17"/>
-        </w:numPr>
         <w:spacing w:after="240"/>
         <w:ind w:left="142" w:hanging="578"/>
         <w:rPr>

</xml_diff>

<commit_message>
RCI Report final fix
</commit_message>
<xml_diff>
--- a/backend/backend/assets/rci_report_template.docx
+++ b/backend/backend/assets/rci_report_template.docx
@@ -2418,16 +2418,16 @@
           <w:bCs/>
           <w:i/>
           <w:iCs/>
-          <w:color w:val="7F7F7F"/>
-          <w:kern w:val="24"/>
-          <w:sz w:val="22"/>
-          <w:szCs w:val="22"/>
-        </w:rPr>
-      </w:pPr>
-      <w:r>
-        <w:rPr>
-          <w:bCs/>
-          <w:color w:val="7F7F7F"/>
+          <w:color w:val="000000"/>
+          <w:kern w:val="24"/>
+          <w:sz w:val="22"/>
+          <w:szCs w:val="22"/>
+        </w:rPr>
+      </w:pPr>
+      <w:r>
+        <w:rPr>
+          <w:bCs/>
+          <w:color w:val="000000"/>
           <w:kern w:val="24"/>
           <w:sz w:val="22"/>
           <w:szCs w:val="22"/>
@@ -2598,16 +2598,16 @@
         <w:ind w:left="11" w:hanging="295"/>
         <w:rPr>
           <w:bCs/>
-          <w:color w:val="A6A6A6" w:themeColor="background1" w:themeShade="A6"/>
-          <w:kern w:val="24"/>
-          <w:sz w:val="22"/>
-          <w:szCs w:val="22"/>
-        </w:rPr>
-      </w:pPr>
-      <w:r>
-        <w:rPr>
-          <w:bCs/>
-          <w:color w:val="A6A6A6" w:themeColor="background1" w:themeShade="A6"/>
+          <w:color w:val="000000"/>
+          <w:kern w:val="24"/>
+          <w:sz w:val="22"/>
+          <w:szCs w:val="22"/>
+        </w:rPr>
+      </w:pPr>
+      <w:r>
+        <w:rPr>
+          <w:bCs/>
+          <w:color w:val="000000"/>
           <w:kern w:val="24"/>
           <w:sz w:val="22"/>
           <w:szCs w:val="22"/>
@@ -2619,7 +2619,7 @@
           <w:bCs/>
           <w:i/>
           <w:iCs/>
-          <w:color w:val="A6A6A6" w:themeColor="background1" w:themeShade="A6"/>
+          <w:color w:val="000000"/>
           <w:kern w:val="24"/>
           <w:sz w:val="22"/>
           <w:szCs w:val="22"/>
@@ -2631,7 +2631,7 @@
           <w:bCs/>
           <w:i/>
           <w:iCs/>
-          <w:color w:val="A6A6A6" w:themeColor="background1" w:themeShade="A6"/>
+          <w:color w:val="000000"/>
           <w:kern w:val="24"/>
           <w:sz w:val="22"/>
           <w:szCs w:val="22"/>
@@ -2643,7 +2643,7 @@
           <w:bCs/>
           <w:i/>
           <w:iCs/>
-          <w:color w:val="A6A6A6" w:themeColor="background1" w:themeShade="A6"/>
+          <w:color w:val="000000"/>
           <w:kern w:val="24"/>
           <w:sz w:val="22"/>
           <w:szCs w:val="22"/>
@@ -2655,7 +2655,7 @@
           <w:bCs/>
           <w:i/>
           <w:iCs/>
-          <w:color w:val="A6A6A6" w:themeColor="background1" w:themeShade="A6"/>
+          <w:color w:val="000000"/>
           <w:kern w:val="24"/>
           <w:sz w:val="22"/>
           <w:szCs w:val="22"/>
@@ -2801,7 +2801,7 @@
           <w:bCs/>
           <w:i/>
           <w:iCs/>
-          <w:color w:val="7F7F7F"/>
+          <w:color w:val="000000"/>
           <w:kern w:val="24"/>
           <w:sz w:val="20"/>
           <w:szCs w:val="20"/>
@@ -2810,7 +2810,7 @@
       <w:r>
         <w:rPr>
           <w:bCs/>
-          <w:color w:val="7F7F7F"/>
+          <w:color w:val="000000"/>
           <w:kern w:val="24"/>
           <w:sz w:val="22"/>
           <w:szCs w:val="22"/>
@@ -2820,7 +2820,7 @@
       <w:r>
         <w:rPr>
           <w:bCs/>
-          <w:color w:val="7F7F7F"/>
+          <w:color w:val="000000"/>
           <w:kern w:val="24"/>
           <w:sz w:val="22"/>
           <w:szCs w:val="22"/>
@@ -2830,7 +2830,7 @@
       <w:r>
         <w:rPr>
           <w:bCs/>
-          <w:color w:val="7F7F7F"/>
+          <w:color w:val="000000"/>
           <w:kern w:val="24"/>
           <w:sz w:val="22"/>
           <w:szCs w:val="22"/>
@@ -2840,7 +2840,7 @@
       <w:r>
         <w:rPr>
           <w:bCs/>
-          <w:color w:val="7F7F7F"/>
+          <w:color w:val="000000"/>
           <w:kern w:val="24"/>
           <w:sz w:val="22"/>
           <w:szCs w:val="22"/>
@@ -2850,7 +2850,7 @@
       <w:r>
         <w:rPr>
           <w:bCs/>
-          <w:color w:val="7F7F7F"/>
+          <w:color w:val="000000"/>
           <w:kern w:val="24"/>
           <w:sz w:val="22"/>
           <w:szCs w:val="22"/>
@@ -2860,7 +2860,7 @@
       <w:r>
         <w:rPr>
           <w:bCs/>
-          <w:color w:val="7F7F7F"/>
+          <w:color w:val="000000"/>
           <w:kern w:val="24"/>
           <w:sz w:val="22"/>
           <w:szCs w:val="22"/>
@@ -2870,7 +2870,7 @@
       <w:r>
         <w:rPr>
           <w:bCs/>
-          <w:color w:val="7F7F7F"/>
+          <w:color w:val="000000"/>
           <w:kern w:val="24"/>
           <w:sz w:val="22"/>
           <w:szCs w:val="22"/>
@@ -2882,7 +2882,7 @@
           <w:bCs/>
           <w:i/>
           <w:iCs/>
-          <w:color w:val="7F7F7F"/>
+          <w:color w:val="000000"/>
           <w:kern w:val="24"/>
           <w:sz w:val="20"/>
           <w:szCs w:val="20"/>
@@ -2895,7 +2895,7 @@
           <w:bCs/>
           <w:i/>
           <w:iCs/>
-          <w:color w:val="7F7F7F"/>
+          <w:color w:val="000000"/>
           <w:kern w:val="24"/>
           <w:sz w:val="20"/>
           <w:szCs w:val="20"/>
@@ -2908,7 +2908,7 @@
           <w:bCs/>
           <w:i/>
           <w:iCs/>
-          <w:color w:val="7F7F7F"/>
+          <w:color w:val="000000"/>
           <w:kern w:val="24"/>
           <w:sz w:val="20"/>
           <w:szCs w:val="20"/>
@@ -3062,16 +3062,16 @@
         <w:ind w:left="11" w:hanging="295"/>
         <w:rPr>
           <w:bCs/>
-          <w:color w:val="7F7F7F"/>
-          <w:kern w:val="24"/>
-          <w:sz w:val="22"/>
-          <w:szCs w:val="22"/>
-        </w:rPr>
-      </w:pPr>
-      <w:r>
-        <w:rPr>
-          <w:bCs/>
-          <w:color w:val="7F7F7F"/>
+          <w:color w:val="000000"/>
+          <w:kern w:val="24"/>
+          <w:sz w:val="22"/>
+          <w:szCs w:val="22"/>
+        </w:rPr>
+      </w:pPr>
+      <w:r>
+        <w:rPr>
+          <w:bCs/>
+          <w:color w:val="000000"/>
           <w:kern w:val="24"/>
           <w:sz w:val="22"/>
           <w:szCs w:val="22"/>
@@ -3081,7 +3081,7 @@
       <w:r>
         <w:rPr>
           <w:bCs/>
-          <w:color w:val="7F7F7F"/>
+          <w:color w:val="000000"/>
           <w:kern w:val="24"/>
           <w:sz w:val="22"/>
           <w:szCs w:val="22"/>
@@ -3091,7 +3091,7 @@
       <w:r>
         <w:rPr>
           <w:bCs/>
-          <w:color w:val="7F7F7F"/>
+          <w:color w:val="000000"/>
           <w:kern w:val="24"/>
           <w:sz w:val="22"/>
           <w:szCs w:val="22"/>
@@ -3214,16 +3214,16 @@
         <w:ind w:left="11" w:hanging="295"/>
         <w:rPr>
           <w:bCs/>
-          <w:color w:val="7F7F7F"/>
-          <w:kern w:val="24"/>
-          <w:sz w:val="22"/>
-          <w:szCs w:val="22"/>
-        </w:rPr>
-      </w:pPr>
-      <w:r>
-        <w:rPr>
-          <w:bCs/>
-          <w:color w:val="7F7F7F"/>
+          <w:color w:val="000000"/>
+          <w:kern w:val="24"/>
+          <w:sz w:val="22"/>
+          <w:szCs w:val="22"/>
+        </w:rPr>
+      </w:pPr>
+      <w:r>
+        <w:rPr>
+          <w:bCs/>
+          <w:color w:val="000000"/>
           <w:kern w:val="24"/>
           <w:sz w:val="22"/>
           <w:szCs w:val="22"/>
@@ -3233,7 +3233,7 @@
       <w:r>
         <w:rPr>
           <w:bCs/>
-          <w:color w:val="7F7F7F"/>
+          <w:color w:val="000000"/>
           <w:kern w:val="24"/>
           <w:sz w:val="22"/>
           <w:szCs w:val="22"/>
@@ -3243,7 +3243,7 @@
       <w:r>
         <w:rPr>
           <w:bCs/>
-          <w:color w:val="7F7F7F"/>
+          <w:color w:val="000000"/>
           <w:kern w:val="24"/>
           <w:sz w:val="22"/>
           <w:szCs w:val="22"/>
@@ -3253,7 +3253,7 @@
       <w:r>
         <w:rPr>
           <w:bCs/>
-          <w:color w:val="7F7F7F"/>
+          <w:color w:val="000000"/>
           <w:kern w:val="24"/>
           <w:sz w:val="22"/>
           <w:szCs w:val="22"/>
@@ -3265,7 +3265,7 @@
           <w:bCs/>
           <w:i/>
           <w:iCs/>
-          <w:color w:val="7F7F7F"/>
+          <w:color w:val="000000"/>
           <w:kern w:val="24"/>
           <w:sz w:val="22"/>
           <w:szCs w:val="22"/>
@@ -3451,16 +3451,16 @@
         <w:ind w:left="11" w:hanging="295"/>
         <w:rPr>
           <w:bCs/>
-          <w:color w:val="7F7F7F"/>
-          <w:kern w:val="24"/>
-          <w:sz w:val="22"/>
-          <w:szCs w:val="22"/>
-        </w:rPr>
-      </w:pPr>
-      <w:r>
-        <w:rPr>
-          <w:bCs/>
-          <w:color w:val="7F7F7F"/>
+          <w:color w:val="000000"/>
+          <w:kern w:val="24"/>
+          <w:sz w:val="22"/>
+          <w:szCs w:val="22"/>
+        </w:rPr>
+      </w:pPr>
+      <w:r>
+        <w:rPr>
+          <w:bCs/>
+          <w:color w:val="000000"/>
           <w:kern w:val="24"/>
           <w:sz w:val="22"/>
           <w:szCs w:val="22"/>
@@ -3470,7 +3470,7 @@
       <w:r>
         <w:rPr>
           <w:bCs/>
-          <w:color w:val="7F7F7F"/>
+          <w:color w:val="000000"/>
           <w:kern w:val="24"/>
           <w:sz w:val="22"/>
           <w:szCs w:val="22"/>
@@ -3480,7 +3480,7 @@
       <w:r>
         <w:rPr>
           <w:bCs/>
-          <w:color w:val="7F7F7F"/>
+          <w:color w:val="000000"/>
           <w:kern w:val="24"/>
           <w:sz w:val="22"/>
           <w:szCs w:val="22"/>
@@ -3490,7 +3490,7 @@
       <w:r>
         <w:rPr>
           <w:bCs/>
-          <w:color w:val="7F7F7F"/>
+          <w:color w:val="000000"/>
           <w:kern w:val="24"/>
           <w:sz w:val="22"/>
           <w:szCs w:val="22"/>
@@ -3500,7 +3500,7 @@
       <w:r>
         <w:rPr>
           <w:bCs/>
-          <w:color w:val="7F7F7F"/>
+          <w:color w:val="000000"/>
           <w:kern w:val="24"/>
           <w:sz w:val="22"/>
           <w:szCs w:val="22"/>
@@ -3512,7 +3512,7 @@
           <w:bCs/>
           <w:i/>
           <w:iCs/>
-          <w:color w:val="7F7F7F"/>
+          <w:color w:val="000000"/>
           <w:kern w:val="24"/>
           <w:sz w:val="20"/>
           <w:szCs w:val="20"/>
@@ -3825,49 +3825,6 @@
               <w:t xml:space="preserve"> happened:</w:t>
             </w:r>
           </w:p>
-          <w:p>
-            <w:pPr>
-              <w:pStyle w:val="Heading1"/>
-              <w:tabs>
-                <w:tab w:val="left" w:pos="709"/>
-              </w:tabs>
-              <w:spacing w:after="240"/>
-              <w:ind w:left="142"/>
-              <w:rPr>
-                <w:rFonts w:ascii="Times New Roman" w:hAnsi="Times New Roman"/>
-                <w:i/>
-                <w:sz w:val="20"/>
-                <w:szCs w:val="20"/>
-                <w:lang w:val="en-GB"/>
-              </w:rPr>
-            </w:pPr>
-            <w:r>
-              <w:rPr>
-                <w:rFonts w:ascii="Times New Roman" w:hAnsi="Times New Roman"/>
-                <w:bCs/>
-                <w:i/>
-                <w:iCs/>
-                <w:color w:val="7F7F7F"/>
-                <w:kern w:val="24"/>
-                <w:sz w:val="20"/>
-                <w:szCs w:val="20"/>
-              </w:rPr>
-              <w:t>Write a summary of what happened</w:t>
-            </w:r>
-            <w:r>
-              <w:rPr>
-                <w:rFonts w:ascii="Times New Roman" w:hAnsi="Times New Roman"/>
-                <w:bCs/>
-                <w:i/>
-                <w:iCs/>
-                <w:color w:val="7F7F7F"/>
-                <w:kern w:val="24"/>
-                <w:sz w:val="20"/>
-                <w:szCs w:val="20"/>
-              </w:rPr>
-              <w:t>.</w:t>
-            </w:r>
-          </w:p>
         </w:tc>
         <w:tc>
           <w:tcPr>
@@ -3925,113 +3882,6 @@
               <w:t xml:space="preserve"> happened:</w:t>
             </w:r>
           </w:p>
-          <w:p>
-            <w:pPr>
-              <w:pStyle w:val="Heading1"/>
-              <w:tabs>
-                <w:tab w:val="left" w:pos="709"/>
-              </w:tabs>
-              <w:spacing w:after="240"/>
-              <w:ind w:left="142"/>
-              <w:rPr>
-                <w:rFonts w:ascii="Times New Roman" w:hAnsi="Times New Roman"/>
-                <w:sz w:val="20"/>
-                <w:szCs w:val="20"/>
-                <w:lang w:val="en-GB"/>
-              </w:rPr>
-            </w:pPr>
-            <w:r>
-              <w:rPr>
-                <w:rFonts w:ascii="Times New Roman" w:hAnsi="Times New Roman"/>
-                <w:bCs/>
-                <w:i/>
-                <w:iCs/>
-                <w:color w:val="7F7F7F"/>
-                <w:kern w:val="24"/>
-                <w:sz w:val="20"/>
-                <w:szCs w:val="20"/>
-              </w:rPr>
-              <w:t xml:space="preserve">Write the details pertaining to </w:t>
-            </w:r>
-            <w:r>
-              <w:rPr>
-                <w:rFonts w:ascii="Times New Roman" w:hAnsi="Times New Roman"/>
-                <w:bCs/>
-                <w:i/>
-                <w:iCs/>
-                <w:color w:val="7F7F7F"/>
-                <w:kern w:val="24"/>
-                <w:sz w:val="20"/>
-                <w:szCs w:val="20"/>
-              </w:rPr>
-              <w:t xml:space="preserve">the </w:t>
-            </w:r>
-            <w:r>
-              <w:rPr>
-                <w:rFonts w:ascii="Times New Roman" w:hAnsi="Times New Roman"/>
-                <w:bCs/>
-                <w:i/>
-                <w:iCs/>
-                <w:color w:val="7F7F7F"/>
-                <w:kern w:val="24"/>
-                <w:sz w:val="20"/>
-                <w:szCs w:val="20"/>
-              </w:rPr>
-              <w:t xml:space="preserve">time/period of failure. In case the failure has happened for </w:t>
-            </w:r>
-            <w:r>
-              <w:rPr>
-                <w:rFonts w:ascii="Times New Roman" w:hAnsi="Times New Roman"/>
-                <w:bCs/>
-                <w:i/>
-                <w:iCs/>
-                <w:color w:val="7F7F7F"/>
-                <w:kern w:val="24"/>
-                <w:sz w:val="20"/>
-                <w:szCs w:val="20"/>
-              </w:rPr>
-              <w:t xml:space="preserve">a </w:t>
-            </w:r>
-            <w:r>
-              <w:rPr>
-                <w:rFonts w:ascii="Times New Roman" w:hAnsi="Times New Roman"/>
-                <w:bCs/>
-                <w:i/>
-                <w:iCs/>
-                <w:color w:val="7F7F7F"/>
-                <w:kern w:val="24"/>
-                <w:sz w:val="20"/>
-                <w:szCs w:val="20"/>
-              </w:rPr>
-              <w:t>certain period, mention the duration (</w:t>
-            </w:r>
-            <w:r>
-              <w:rPr>
-                <w:rFonts w:ascii="Times New Roman" w:hAnsi="Times New Roman"/>
-                <w:bCs/>
-                <w:i/>
-                <w:iCs/>
-                <w:color w:val="7F7F7F"/>
-                <w:kern w:val="24"/>
-                <w:sz w:val="20"/>
-                <w:szCs w:val="20"/>
-              </w:rPr>
-              <w:t>from-to</w:t>
-            </w:r>
-            <w:r>
-              <w:rPr>
-                <w:rFonts w:ascii="Times New Roman" w:hAnsi="Times New Roman"/>
-                <w:bCs/>
-                <w:i/>
-                <w:iCs/>
-                <w:color w:val="7F7F7F"/>
-                <w:kern w:val="24"/>
-                <w:sz w:val="20"/>
-                <w:szCs w:val="20"/>
-              </w:rPr>
-              <w:t>). Mention ‘NA’ if not applicable.</w:t>
-            </w:r>
-          </w:p>
         </w:tc>
         <w:tc>
           <w:tcPr>
@@ -4095,75 +3945,6 @@
               <w:t>:</w:t>
             </w:r>
           </w:p>
-          <w:p>
-            <w:pPr>
-              <w:pStyle w:val="Heading1"/>
-              <w:tabs>
-                <w:tab w:val="left" w:pos="709"/>
-              </w:tabs>
-              <w:spacing w:after="240"/>
-              <w:ind w:left="142"/>
-              <w:rPr>
-                <w:rFonts w:ascii="Times New Roman" w:hAnsi="Times New Roman"/>
-                <w:i/>
-                <w:sz w:val="20"/>
-                <w:szCs w:val="20"/>
-                <w:lang w:val="en-GB"/>
-              </w:rPr>
-            </w:pPr>
-            <w:r>
-              <w:rPr>
-                <w:rFonts w:ascii="Times New Roman" w:hAnsi="Times New Roman"/>
-                <w:bCs/>
-                <w:i/>
-                <w:iCs/>
-                <w:color w:val="7F7F7F"/>
-                <w:kern w:val="24"/>
-                <w:sz w:val="20"/>
-                <w:szCs w:val="20"/>
-              </w:rPr>
-              <w:t xml:space="preserve">Write the name of people who </w:t>
-            </w:r>
-            <w:r>
-              <w:rPr>
-                <w:rFonts w:ascii="Times New Roman" w:hAnsi="Times New Roman"/>
-                <w:bCs/>
-                <w:i/>
-                <w:iCs/>
-                <w:color w:val="7F7F7F"/>
-                <w:kern w:val="24"/>
-                <w:sz w:val="20"/>
-                <w:szCs w:val="20"/>
-              </w:rPr>
-              <w:t xml:space="preserve">identified the </w:t>
-            </w:r>
-            <w:r>
-              <w:rPr>
-                <w:rFonts w:ascii="Times New Roman" w:hAnsi="Times New Roman"/>
-                <w:bCs/>
-                <w:i/>
-                <w:iCs/>
-                <w:color w:val="7F7F7F"/>
-                <w:kern w:val="24"/>
-                <w:sz w:val="20"/>
-                <w:szCs w:val="20"/>
-              </w:rPr>
-              <w:t>non-conformance</w:t>
-            </w:r>
-            <w:r>
-              <w:rPr>
-                <w:rFonts w:ascii="Times New Roman" w:hAnsi="Times New Roman"/>
-                <w:bCs/>
-                <w:i/>
-                <w:iCs/>
-                <w:color w:val="7F7F7F"/>
-                <w:kern w:val="24"/>
-                <w:sz w:val="20"/>
-                <w:szCs w:val="20"/>
-              </w:rPr>
-              <w:t>.</w:t>
-            </w:r>
-          </w:p>
         </w:tc>
         <w:tc>
           <w:tcPr>
@@ -4231,72 +4012,6 @@
               <w:t xml:space="preserve"> took place/identified</w:t>
             </w:r>
           </w:p>
-          <w:p>
-            <w:pPr>
-              <w:pStyle w:val="Heading1"/>
-              <w:tabs>
-                <w:tab w:val="left" w:pos="709"/>
-              </w:tabs>
-              <w:spacing w:after="240"/>
-              <w:ind w:left="142"/>
-              <w:rPr>
-                <w:rFonts w:ascii="Times New Roman" w:hAnsi="Times New Roman"/>
-                <w:i/>
-                <w:sz w:val="20"/>
-                <w:szCs w:val="20"/>
-                <w:lang w:val="en-GB"/>
-              </w:rPr>
-            </w:pPr>
-            <w:r>
-              <w:rPr>
-                <w:rFonts w:ascii="Times New Roman" w:hAnsi="Times New Roman"/>
-                <w:bCs/>
-                <w:i/>
-                <w:iCs/>
-                <w:color w:val="7F7F7F"/>
-                <w:kern w:val="24"/>
-                <w:sz w:val="20"/>
-                <w:szCs w:val="20"/>
-              </w:rPr>
-              <w:t xml:space="preserve">Write the location/place/area where the failure happened and/or </w:t>
-            </w:r>
-            <w:r>
-              <w:rPr>
-                <w:rFonts w:ascii="Times New Roman" w:hAnsi="Times New Roman"/>
-                <w:bCs/>
-                <w:i/>
-                <w:iCs/>
-                <w:color w:val="7F7F7F"/>
-                <w:kern w:val="24"/>
-                <w:sz w:val="20"/>
-                <w:szCs w:val="20"/>
-              </w:rPr>
-              <w:t xml:space="preserve">was </w:t>
-            </w:r>
-            <w:r>
-              <w:rPr>
-                <w:rFonts w:ascii="Times New Roman" w:hAnsi="Times New Roman"/>
-                <w:bCs/>
-                <w:i/>
-                <w:iCs/>
-                <w:color w:val="7F7F7F"/>
-                <w:kern w:val="24"/>
-                <w:sz w:val="20"/>
-                <w:szCs w:val="20"/>
-              </w:rPr>
-              <w:t>detected.</w:t>
-            </w:r>
-            <w:r>
-              <w:rPr>
-                <w:rFonts w:ascii="Times New Roman" w:hAnsi="Times New Roman"/>
-                <w:i/>
-                <w:sz w:val="20"/>
-                <w:szCs w:val="20"/>
-                <w:lang w:val="en-GB"/>
-              </w:rPr>
-              <w:t xml:space="preserve"> </w:t>
-            </w:r>
-          </w:p>
         </w:tc>
         <w:tc>
           <w:tcPr>
@@ -4379,35 +4094,6 @@
               <w:t>be non-conforming?</w:t>
             </w:r>
           </w:p>
-          <w:p>
-            <w:pPr>
-              <w:pStyle w:val="Heading1"/>
-              <w:tabs>
-                <w:tab w:val="left" w:pos="709"/>
-              </w:tabs>
-              <w:spacing w:after="240"/>
-              <w:ind w:left="142"/>
-              <w:rPr>
-                <w:rFonts w:ascii="Times New Roman" w:hAnsi="Times New Roman"/>
-                <w:i/>
-                <w:sz w:val="20"/>
-                <w:szCs w:val="20"/>
-              </w:rPr>
-            </w:pPr>
-            <w:r>
-              <w:rPr>
-                <w:rFonts w:ascii="Times New Roman" w:hAnsi="Times New Roman"/>
-                <w:bCs/>
-                <w:i/>
-                <w:iCs/>
-                <w:color w:val="7F7F7F"/>
-                <w:kern w:val="24"/>
-                <w:sz w:val="20"/>
-                <w:szCs w:val="20"/>
-              </w:rPr>
-              <w:t>Write SOP / Protocol / Specification / etc. which was found to have been deviated or non-conforming</w:t>
-            </w:r>
-          </w:p>
         </w:tc>
         <w:tc>
           <w:tcPr>
@@ -4462,36 +4148,6 @@
                 <w:szCs w:val="22"/>
               </w:rPr>
               <w:t xml:space="preserve"> the failure is detected</w:t>
-            </w:r>
-          </w:p>
-          <w:p>
-            <w:pPr>
-              <w:pStyle w:val="Heading1"/>
-              <w:tabs>
-                <w:tab w:val="left" w:pos="709"/>
-              </w:tabs>
-              <w:spacing w:after="240"/>
-              <w:ind w:left="142"/>
-              <w:rPr>
-                <w:rFonts w:ascii="Times New Roman" w:hAnsi="Times New Roman"/>
-                <w:i/>
-                <w:sz w:val="20"/>
-                <w:szCs w:val="20"/>
-                <w:lang w:val="en-GB"/>
-              </w:rPr>
-            </w:pPr>
-            <w:r>
-              <w:rPr>
-                <w:rFonts w:ascii="Times New Roman" w:hAnsi="Times New Roman"/>
-                <w:bCs/>
-                <w:i/>
-                <w:iCs/>
-                <w:color w:val="7F7F7F"/>
-                <w:kern w:val="24"/>
-                <w:sz w:val="20"/>
-                <w:szCs w:val="20"/>
-              </w:rPr>
-              <w:t>Write the detection step at which the failure was noticed/detected</w:t>
             </w:r>
           </w:p>
         </w:tc>
@@ -6390,8 +6046,6 @@
           <w:sz w:val="22"/>
           <w:szCs w:val="22"/>
         </w:rPr>
-        <w:lastRenderedPageBreak/>
-        <w:t>*</w:t>
       </w:r>
       <w:r>
         <w:rPr>
@@ -8716,103 +8370,6 @@
         <w:t xml:space="preserve"> </w:t>
       </w:r>
     </w:p>
-    <w:tbl>
-      <w:tblPr>
-        <w:tblW w:w="10292" w:type="dxa"/>
-        <w:tblInd w:w="-142" w:type="dxa"/>
-        <w:tblLayout w:type="fixed"/>
-        <w:tblLook w:val="0400" w:firstRow="0" w:lastRow="0" w:firstColumn="0" w:lastColumn="0" w:noHBand="0" w:noVBand="1"/>
-      </w:tblPr>
-      <w:tblGrid>
-        <w:gridCol w:w="10292"/>
-      </w:tblGrid>
-      <w:tr>
-        <w:trPr>
-          <w:trHeight w:val="595"/>
-        </w:trPr>
-        <w:tc>
-          <w:tcPr>
-            <w:tcW w:w="10292" w:type="dxa"/>
-          </w:tcPr>
-          <w:p>
-            <w:pPr>
-              <w:pStyle w:val="Default"/>
-              <w:spacing w:before="100" w:beforeAutospacing="1"/>
-              <w:ind w:left="133"/>
-              <w:contextualSpacing/>
-              <w:jc w:val="both"/>
-              <w:rPr>
-                <w:rFonts w:eastAsia="Times New Roman"/>
-                <w:bCs/>
-                <w:i/>
-                <w:iCs/>
-                <w:color w:val="7F7F7F"/>
-                <w:kern w:val="24"/>
-                <w:sz w:val="22"/>
-                <w:szCs w:val="22"/>
-                <w:lang w:val="en-US"/>
-              </w:rPr>
-            </w:pPr>
-            <w:r>
-              <w:rPr>
-                <w:rFonts w:eastAsia="Times New Roman"/>
-                <w:bCs/>
-                <w:i/>
-                <w:iCs/>
-                <w:color w:val="7F7F7F"/>
-                <w:kern w:val="24"/>
-                <w:sz w:val="22"/>
-                <w:szCs w:val="22"/>
-                <w:lang w:val="en-US"/>
-              </w:rPr>
-              <w:t>Correction: Action taken for an immediate fix that corrects the situation.</w:t>
-            </w:r>
-          </w:p>
-        </w:tc>
-      </w:tr>
-      <w:tr>
-        <w:trPr>
-          <w:trHeight w:val="595"/>
-        </w:trPr>
-        <w:tc>
-          <w:tcPr>
-            <w:tcW w:w="10292" w:type="dxa"/>
-          </w:tcPr>
-          <w:p>
-            <w:pPr>
-              <w:tabs>
-                <w:tab w:val="left" w:pos="739"/>
-              </w:tabs>
-              <w:spacing w:before="100" w:beforeAutospacing="1" w:after="70"/>
-              <w:ind w:left="133"/>
-              <w:contextualSpacing/>
-              <w:jc w:val="both"/>
-              <w:rPr>
-                <w:bCs/>
-                <w:i/>
-                <w:iCs/>
-                <w:color w:val="7F7F7F"/>
-                <w:kern w:val="24"/>
-                <w:sz w:val="22"/>
-                <w:szCs w:val="22"/>
-              </w:rPr>
-            </w:pPr>
-            <w:r>
-              <w:rPr>
-                <w:bCs/>
-                <w:i/>
-                <w:iCs/>
-                <w:color w:val="7F7F7F"/>
-                <w:kern w:val="24"/>
-                <w:sz w:val="22"/>
-                <w:szCs w:val="22"/>
-              </w:rPr>
-              <w:t xml:space="preserve">Remedial action: An action taken to improve a situation to address or correct a non-conformance, and return the process, product, or materials to an acceptable state of control or quality. </w:t>
-            </w:r>
-          </w:p>
-        </w:tc>
-      </w:tr>
-    </w:tbl>
     <w:p>
       <w:pPr>
         <w:pStyle w:val="ListParagraph"/>

</xml_diff>